<commit_message>
Twin 1: L03 p09-p16 (16/35); +5 printed DIBY (Rapid Fire 01-05); logged printed chip typo IVRTATIONAL
Co-authored-by: arena-agent <297053741+arena-agent@users.noreply.github.com>
</commit_message>
<xml_diff>
--- a/deliverables/twin-1/transcripts/binomial-theorem-l03.docx
+++ b/deliverables/twin-1/transcripts/binomial-theorem-l03.docx
@@ -851,6 +851,768 @@
       </w:r>
       <w:r>
         <w:t xml:space="preserve"> none on this page (it is the solution of a DIBY item). </w:t>
+      </w:r>
+      <w:r>
+        <w:rPr>
+          <w:b/>
+        </w:rPr>
+        <w:t>U:</w:t>
+      </w:r>
+      <w:r>
+        <w:t xml:space="preserve"> none.</w:t>
+      </w:r>
+    </w:p>
+    <w:p>
+      <w:pPr>
+        <w:pStyle w:val="Heading1"/>
+      </w:pPr>
+      <w:r>
+        <w:t>p09 · Question [JEE (Adv.)–2023 — solves L02 p24 H.W. · label: Page No. 151</w:t>
+      </w:r>
+    </w:p>
+    <w:p>
+      <w:r>
+        <w:rPr>
+          <w:b/>
+        </w:rPr>
+        <w:t>P:</w:t>
+      </w:r>
+      <w:r>
+        <w:t xml:space="preserve"> chip </w:t>
+      </w:r>
+      <w:r>
+        <w:rPr>
+          <w:b/>
+        </w:rPr>
+        <w:t>Question [JEE (Adv.)–2023</w:t>
+      </w:r>
+      <w:r>
+        <w:t xml:space="preserve"> (printed without closing bracket, as in L02 p24); top-right </w:t>
+      </w:r>
+      <w:r>
+        <w:rPr>
+          <w:b/>
+        </w:rPr>
+        <w:t>[Ans.: 3]</w:t>
+      </w:r>
+      <w:r>
+        <w:t>; same stem as L02 p24 (</w:t>
+      </w:r>
+      <w:r>
+        <w:rPr>
+          <w:i/>
+        </w:rPr>
+        <w:t>a, b nonzero reals; coeff of x⁵ in (ax² + 70/(27bx))⁴ = coeff of x⁻⁵ in (ax − 1/(bx²))⁷; find 2b</w:t>
+      </w:r>
+      <w:r>
+        <w:t>).</w:t>
+      </w:r>
+    </w:p>
+    <w:p>
+      <w:r>
+        <w:rPr>
+          <w:b/>
+        </w:rPr>
+        <w:t>H:</w:t>
+      </w:r>
+      <w:r>
+        <w:t xml:space="preserve"> orange leader to orange Tᵣ₊₁ = ⁴C (ax²)^{4−r} (70/(2⁴bx))ʳ then = [⁴Cᵣ a^{4−r} 70ʳ / (2⁴b)ʳ] in a red box; cyan ring 8−3r → cyan 8−3r = 5 → circled r=1; cyan leader to white/pink Tᵣ₊₁ = ⁷C (ax)^{4−r}... (−1/(bx²))^r and = [⁷Cᵣ a^{4−r}(−1)ʳ/bʳ] in a red box; orange ring 4−3r → 7−3r = −5 → 12 = 3r → circled r=4; pink coeff of x⁵ = red box ⁴C₁ a³·70/(2⁴b) = ⁷C₄ a³·(−1)⁴/b⁴ (a³ struck through on both sides) → white b = 3/2; white circle 3 with arrow to "2b is"; pink tick marks through both red boxes' fractions.</w:t>
+      </w:r>
+    </w:p>
+    <w:p>
+      <w:r>
+        <w:rPr>
+          <w:b/>
+        </w:rPr>
+        <w:t>DIBY:</w:t>
+      </w:r>
+      <w:r>
+        <w:t xml:space="preserve"> none. </w:t>
+      </w:r>
+      <w:r>
+        <w:rPr>
+          <w:b/>
+        </w:rPr>
+        <w:t>U:</w:t>
+      </w:r>
+      <w:r>
+        <w:t xml:space="preserve"> none.</w:t>
+      </w:r>
+    </w:p>
+    <w:p>
+      <w:pPr>
+        <w:pStyle w:val="Heading1"/>
+      </w:pPr>
+      <w:r>
+        <w:t>p10 · (7^{1/5} − 3^{1/10})^{60} — rational vs irrational count · label: — (PW roundel)</w:t>
+      </w:r>
+    </w:p>
+    <w:p>
+      <w:r>
+        <w:rPr>
+          <w:b/>
+        </w:rPr>
+        <w:t>H (whole page):</w:t>
+      </w:r>
+      <w:r>
+        <w:t xml:space="preserve"> cyan (7^{1/5} − 3^{1/10})^{60}; yellow Total terms = 60 + 1 = 61 .; green Tᵣ₊₁ = ⁶⁰Cᵣ (7^{1/5})^{60−r} (−3^{1/10})ʳ and Tᵣ₊₁ = ⁶⁰Cᵣ (7)^{(60−r)/5} (−1)ʳ 3^{r/10} (the 7 and 3 marked ≑); green both with an up-arrow; pink Rational ⇒ (60−r)/5 (&amp;, 9 ringed cyan) r/10 → integer; cyan (60−r)/5 = 12 − r/5 = Int → list r = 0,5,10,15,20,25,30,35,40,45,50,55,60; cyan r/10 = Int → list r = 0,10,20,30,40,50,60; a cyan brace joining both lists → r = 0,10,20,30 … 60 .; green left ⁶⁰C with arrow down to pink r ∈ W, 0 ≤ r ≤ 60; pink red-boxed </w:t>
+      </w:r>
+      <w:r>
+        <w:rPr>
+          <w:b/>
+        </w:rPr>
+        <w:t>`Rational Terms = 7`</w:t>
+      </w:r>
+      <w:r>
+        <w:t xml:space="preserve"> and </w:t>
+      </w:r>
+      <w:r>
+        <w:rPr>
+          <w:b/>
+        </w:rPr>
+        <w:t>`IrrRational Terms = 61 − 7 = 54`</w:t>
+      </w:r>
+      <w:r>
+        <w:t xml:space="preserve"> (54 double-underlined); pink right arrow r = 1 into a red box ⁶⁰ − C₁ 7^{59/5} · 3^{1/10} labelled irrational (written as ⁶⁰₋C₁, as drawn).</w:t>
+      </w:r>
+    </w:p>
+    <w:p>
+      <w:r>
+        <w:rPr>
+          <w:b/>
+        </w:rPr>
+        <w:t>DIBY:</w:t>
+      </w:r>
+      <w:r>
+        <w:t xml:space="preserve"> none. </w:t>
+      </w:r>
+      <w:r>
+        <w:rPr>
+          <w:b/>
+        </w:rPr>
+        <w:t>U:</w:t>
+      </w:r>
+      <w:r>
+        <w:t xml:space="preserve"> none.</w:t>
+      </w:r>
+    </w:p>
+    <w:p>
+      <w:pPr>
+        <w:pStyle w:val="Heading1"/>
+      </w:pPr>
+      <w:r>
+        <w:t>p11 · RAPID FIRE DIBY'S — DIBY-01, DIBY-02 (printed) · label: — (chip only)</w:t>
+      </w:r>
+    </w:p>
+    <w:p>
+      <w:r>
+        <w:rPr>
+          <w:b/>
+        </w:rPr>
+        <w:t>P:</w:t>
+      </w:r>
+      <w:r>
+        <w:t xml:space="preserve"> chip </w:t>
+      </w:r>
+      <w:r>
+        <w:rPr>
+          <w:b/>
+        </w:rPr>
+        <w:t>RAPID FIRE DIBY'S</w:t>
+      </w:r>
+      <w:r>
+        <w:t>;</w:t>
+      </w:r>
+    </w:p>
+    <w:p>
+      <w:pPr>
+        <w:pStyle w:val="ListBullet"/>
+      </w:pPr>
+      <w:r>
+        <w:rPr>
+          <w:b/>
+        </w:rPr>
+        <w:t># DIBY-01</w:t>
+      </w:r>
+      <w:r>
+        <w:t xml:space="preserve"> — </w:t>
+      </w:r>
+      <w:r>
+        <w:rPr>
+          <w:b/>
+        </w:rPr>
+        <w:t>Find the term independent of x in the expansion of (3x²/2 − 1/(3x))⁹.</w:t>
+      </w:r>
+      <w:r>
+        <w:t xml:space="preserve"> — options </w:t>
+      </w:r>
+      <w:r>
+        <w:rPr>
+          <w:b/>
+        </w:rPr>
+        <w:t>(A) 7/54  (B) −7/18  (C) 7/18  (D) −7/54</w:t>
+      </w:r>
+      <w:r>
+        <w:t xml:space="preserve"> — </w:t>
+      </w:r>
+      <w:r>
+        <w:rPr>
+          <w:b/>
+        </w:rPr>
+        <w:t>[Ans.: (C)]</w:t>
+      </w:r>
+    </w:p>
+    <w:p>
+      <w:pPr>
+        <w:pStyle w:val="ListBullet"/>
+      </w:pPr>
+      <w:r>
+        <w:rPr>
+          <w:b/>
+        </w:rPr>
+        <w:t># DIBY-02</w:t>
+      </w:r>
+      <w:r>
+        <w:t xml:space="preserve"> — </w:t>
+      </w:r>
+      <w:r>
+        <w:rPr>
+          <w:b/>
+        </w:rPr>
+        <w:t>Find n if ratio of the 7ᵗʰ term from the beginning to the 7ᵗʰ term from the end in the expansion of (2^{1/3} + 3^{−1/3})ⁿ is 1/6.</w:t>
+      </w:r>
+      <w:r>
+        <w:t xml:space="preserve"> — options </w:t>
+      </w:r>
+      <w:r>
+        <w:rPr>
+          <w:b/>
+        </w:rPr>
+        <w:t>(A) 9  (B) 8  (C) 7  (D) 6</w:t>
+      </w:r>
+      <w:r>
+        <w:t xml:space="preserve"> — </w:t>
+      </w:r>
+      <w:r>
+        <w:rPr>
+          <w:b/>
+        </w:rPr>
+        <w:t>[Ans.: (A)]</w:t>
+      </w:r>
+    </w:p>
+    <w:p>
+      <w:r>
+        <w:rPr>
+          <w:b/>
+        </w:rPr>
+        <w:t>H:</w:t>
+      </w:r>
+      <w:r>
+        <w:t xml:space="preserve"> none. </w:t>
+      </w:r>
+      <w:r>
+        <w:rPr>
+          <w:b/>
+        </w:rPr>
+        <w:t>DIBY:</w:t>
+      </w:r>
+      <w:r>
+        <w:t xml:space="preserve"> YES ×2 — printed DIBY-01, DIBY-02. </w:t>
+      </w:r>
+      <w:r>
+        <w:rPr>
+          <w:b/>
+        </w:rPr>
+        <w:t>U:</w:t>
+      </w:r>
+      <w:r>
+        <w:t xml:space="preserve"> none.</w:t>
+      </w:r>
+    </w:p>
+    <w:p>
+      <w:pPr>
+        <w:pStyle w:val="Heading1"/>
+      </w:pPr>
+      <w:r>
+        <w:t>p12 · Question [JEE Mains–2024] — solves L02 p27 H.W. (n/m)^{1/3} · label: Page No. 149</w:t>
+      </w:r>
+    </w:p>
+    <w:p>
+      <w:r>
+        <w:rPr>
+          <w:b/>
+        </w:rPr>
+        <w:t>P:</w:t>
+      </w:r>
+      <w:r>
+        <w:t xml:space="preserve"> chip </w:t>
+      </w:r>
+      <w:r>
+        <w:rPr>
+          <w:b/>
+        </w:rPr>
+        <w:t>Question [JEE Mains–2024]</w:t>
+      </w:r>
+      <w:r>
+        <w:t>; same stem as L02 p27 (</w:t>
+      </w:r>
+      <w:r>
+        <w:rPr>
+          <w:i/>
+        </w:rPr>
+        <w:t>m, n = coefficients of 7th and 13th terms of (x^{1/3}/3 + 1/(2x^{2/3}))^{18}; then (n/m)^{1/3} is</w:t>
+      </w:r>
+      <w:r>
+        <w:t xml:space="preserve">); options </w:t>
+      </w:r>
+      <w:r>
+        <w:rPr>
+          <w:b/>
+        </w:rPr>
+        <w:t>A 4/9, B 1/9, C 1/4, D 9/4</w:t>
+      </w:r>
+      <w:r>
+        <w:t>.</w:t>
+      </w:r>
+    </w:p>
+    <w:p>
+      <w:r>
+        <w:rPr>
+          <w:b/>
+        </w:rPr>
+        <w:t>H:</w:t>
+      </w:r>
+      <w:r>
+        <w:t xml:space="preserve"> white 76% with a double rule (top-right); white leader to pink Tᵣ₊₁ = ¹⁸C (x^{1/3}/3)^{18−r} (1/(2x^{2/3}))ʳ; pink Tᵣ₊₁ = ¹⁸Cᵣ (1/3)^{18−r} (1/2)ʳ x^{6−r}; pink arrows r = 6 → red box T₇ = ¹⁸C₆ (1/3)^{12} (1/2)^{6} labelled m, and r = 12 → red box T₁₃ = ¹⁸C₁₂ (1/3)⁶ (1/2)^{12} x^{−6} labelled n; cyan right n/m = [¹⁸C₁₂ (1/3)⁶ (1/2)^{12}] / [¹⁸C (1/3)^{12} (1/2)⁶] with ¹⁸C₁₂, ¹⁸C₆ and the (1/2)⁶/(1/2)^{12} pairs struck → = ( (1/2)/(1/3) )⁶ → n/m = (3/2)⁶ → (n/m)^{1/3} = ((3/2)⁶)^{1/3} = (3/2)²; cyan tick through option </w:t>
+      </w:r>
+      <w:r>
+        <w:rPr>
+          <w:b/>
+        </w:rPr>
+        <w:t>D</w:t>
+      </w:r>
+      <w:r>
+        <w:t>.</w:t>
+      </w:r>
+    </w:p>
+    <w:p>
+      <w:r>
+        <w:rPr>
+          <w:b/>
+        </w:rPr>
+        <w:t>DIBY:</w:t>
+      </w:r>
+      <w:r>
+        <w:t xml:space="preserve"> none. </w:t>
+      </w:r>
+      <w:r>
+        <w:rPr>
+          <w:b/>
+        </w:rPr>
+        <w:t>U:</w:t>
+      </w:r>
+      <w:r>
+        <w:t xml:space="preserve"> none.</w:t>
+      </w:r>
+    </w:p>
+    <w:p>
+      <w:pPr>
+        <w:pStyle w:val="Heading1"/>
+      </w:pPr>
+      <w:r>
+        <w:t>p13 · Question [Multiple Correct] — (4^{1/3} + 1/6^{1/4})²⁰ · label: Page No. 151</w:t>
+      </w:r>
+    </w:p>
+    <w:p>
+      <w:r>
+        <w:rPr>
+          <w:b/>
+        </w:rPr>
+        <w:t>P:</w:t>
+      </w:r>
+      <w:r>
+        <w:t xml:space="preserve"> chip </w:t>
+      </w:r>
+      <w:r>
+        <w:rPr>
+          <w:b/>
+        </w:rPr>
+        <w:t>Question [Multiple Correct]</w:t>
+      </w:r>
+      <w:r>
+        <w:t xml:space="preserve">; </w:t>
+      </w:r>
+      <w:r>
+        <w:rPr>
+          <w:b/>
+        </w:rPr>
+        <w:t>In the expansion (4^{1/3} + 1/6^{1/4})²⁰ which of the following hold good?</w:t>
+      </w:r>
+      <w:r>
+        <w:t xml:space="preserve"> (binomial cyan); options </w:t>
+      </w:r>
+      <w:r>
+        <w:rPr>
+          <w:b/>
+        </w:rPr>
+        <w:t>A</w:t>
+      </w:r>
+      <w:r>
+        <w:t xml:space="preserve"> no. of irrational term = 19 · </w:t>
+      </w:r>
+      <w:r>
+        <w:rPr>
+          <w:b/>
+        </w:rPr>
+        <w:t>B</w:t>
+      </w:r>
+      <w:r>
+        <w:t xml:space="preserve"> middle term is irrational · </w:t>
+      </w:r>
+      <w:r>
+        <w:rPr>
+          <w:b/>
+        </w:rPr>
+        <w:t>C</w:t>
+      </w:r>
+      <w:r>
+        <w:t xml:space="preserve"> no. of rational term = 2 · </w:t>
+      </w:r>
+      <w:r>
+        <w:rPr>
+          <w:b/>
+        </w:rPr>
+        <w:t>D</w:t>
+      </w:r>
+      <w:r>
+        <w:t xml:space="preserve"> none.</w:t>
+      </w:r>
+    </w:p>
+    <w:p>
+      <w:r>
+        <w:rPr>
+          <w:b/>
+        </w:rPr>
+        <w:t>H:</w:t>
+      </w:r>
+      <w:r>
+        <w:t xml:space="preserve"> white leader from the chip to 21 − 2 with a ≑ mark under the 2; pink leader to pink Tᵣ₊₁ = ²⁰C (4^{1/3})^{20−r} (1/6^{1/4})ʳ; green = ²⁰Cᵣ then green ring 2^{(40−2r)/3} and 2^{r/4} 3^{r/4} with a struck 1 above; green Tᵣ₊₁ = ²⁰Cᵣ 2^{(160−11r)/12} 3^{−r/4}; pink arrows from option B to three pink circles (20+1)/2 ✗, (20+2)/2 → 11ᵗ, (20+3)/2 ✗; white ticks through options A, C and a pink tick at B.</w:t>
+      </w:r>
+    </w:p>
+    <w:p>
+      <w:r>
+        <w:rPr>
+          <w:b/>
+        </w:rPr>
+        <w:t>DIBY:</w:t>
+      </w:r>
+      <w:r>
+        <w:t xml:space="preserve"> none. </w:t>
+      </w:r>
+      <w:r>
+        <w:rPr>
+          <w:b/>
+        </w:rPr>
+        <w:t>U:</w:t>
+      </w:r>
+      <w:r>
+        <w:t xml:space="preserve"> none.</w:t>
+      </w:r>
+    </w:p>
+    <w:p>
+      <w:pPr>
+        <w:pStyle w:val="Heading1"/>
+      </w:pPr>
+      <w:r>
+        <w:t>p14 · RAPID FIRE DIBY'S — DIBY-03, DIBY-04, DIBY-05 (printed) · label: — (chip only)</w:t>
+      </w:r>
+    </w:p>
+    <w:p>
+      <w:r>
+        <w:rPr>
+          <w:b/>
+        </w:rPr>
+        <w:t>P:</w:t>
+      </w:r>
+      <w:r>
+        <w:t xml:space="preserve"> chip </w:t>
+      </w:r>
+      <w:r>
+        <w:rPr>
+          <w:b/>
+        </w:rPr>
+        <w:t>RAPID FIRE DIBY'S</w:t>
+      </w:r>
+      <w:r>
+        <w:t>;</w:t>
+      </w:r>
+    </w:p>
+    <w:p>
+      <w:pPr>
+        <w:pStyle w:val="ListBullet"/>
+      </w:pPr>
+      <w:r>
+        <w:rPr>
+          <w:b/>
+        </w:rPr>
+        <w:t># DIBY-03</w:t>
+      </w:r>
+      <w:r>
+        <w:t xml:space="preserve"> </w:t>
+      </w:r>
+      <w:r>
+        <w:rPr>
+          <w:b/>
+        </w:rPr>
+        <w:t>Find the coefficient of x³² in the expansion of (x⁴ − 1/x³)¹⁵.</w:t>
+      </w:r>
+      <w:r>
+        <w:t xml:space="preserve"> options </w:t>
+      </w:r>
+      <w:r>
+        <w:rPr>
+          <w:b/>
+        </w:rPr>
+        <w:t>(A) −1365 (B) 1365 (C) −3003 (D) 3003</w:t>
+      </w:r>
+      <w:r>
+        <w:t xml:space="preserve"> — </w:t>
+      </w:r>
+      <w:r>
+        <w:rPr>
+          <w:b/>
+        </w:rPr>
+        <w:t>[Ans.: (B)]</w:t>
+      </w:r>
+    </w:p>
+    <w:p>
+      <w:pPr>
+        <w:pStyle w:val="ListBullet"/>
+      </w:pPr>
+      <w:r>
+        <w:rPr>
+          <w:b/>
+        </w:rPr>
+        <w:t># DIBY-04</w:t>
+      </w:r>
+      <w:r>
+        <w:t xml:space="preserve"> </w:t>
+      </w:r>
+      <w:r>
+        <w:rPr>
+          <w:b/>
+        </w:rPr>
+        <w:t>The 4ᵗʰ term from the end in the expansion of (3/x² − x³/6)⁷ is</w:t>
+      </w:r>
+      <w:r>
+        <w:t xml:space="preserve"> options </w:t>
+      </w:r>
+      <w:r>
+        <w:rPr>
+          <w:b/>
+        </w:rPr>
+        <w:t>(A) 35/8 x³ (B) −35/48 x³ (C) −35/8 x⁶ (D) 35/48 x⁶</w:t>
+      </w:r>
+      <w:r>
+        <w:t xml:space="preserve"> — </w:t>
+      </w:r>
+      <w:r>
+        <w:rPr>
+          <w:b/>
+        </w:rPr>
+        <w:t>[Ans.: (D)]</w:t>
+      </w:r>
+    </w:p>
+    <w:p>
+      <w:pPr>
+        <w:pStyle w:val="ListBullet"/>
+      </w:pPr>
+      <w:r>
+        <w:rPr>
+          <w:b/>
+        </w:rPr>
+        <w:t># DIBY-05</w:t>
+      </w:r>
+      <w:r>
+        <w:t xml:space="preserve"> </w:t>
+      </w:r>
+      <w:r>
+        <w:rPr>
+          <w:b/>
+        </w:rPr>
+        <w:t>Find the greatest value of the term independent of x in the expansion of (x sin α + (1/x) cos α)¹⁰, where α ∈ ℝ.</w:t>
+      </w:r>
+      <w:r>
+        <w:t xml:space="preserve"> options </w:t>
+      </w:r>
+      <w:r>
+        <w:rPr>
+          <w:b/>
+        </w:rPr>
+        <w:t>(A) 63/8 (B) 63/16 (C) 63/32 (D) 63/64</w:t>
+      </w:r>
+      <w:r>
+        <w:t xml:space="preserve"> — </w:t>
+      </w:r>
+      <w:r>
+        <w:rPr>
+          <w:b/>
+        </w:rPr>
+        <w:t>[Ans.: (A)]</w:t>
+      </w:r>
+    </w:p>
+    <w:p>
+      <w:r>
+        <w:rPr>
+          <w:b/>
+        </w:rPr>
+        <w:t>H:</w:t>
+      </w:r>
+      <w:r>
+        <w:t xml:space="preserve"> none. </w:t>
+      </w:r>
+      <w:r>
+        <w:rPr>
+          <w:b/>
+        </w:rPr>
+        <w:t>DIBY:</w:t>
+      </w:r>
+      <w:r>
+        <w:t xml:space="preserve"> YES ×3 — printed DIBY-03, DIBY-04, DIBY-05. </w:t>
+      </w:r>
+      <w:r>
+        <w:rPr>
+          <w:b/>
+        </w:rPr>
+        <w:t>U:</w:t>
+      </w:r>
+      <w:r>
+        <w:t xml:space="preserve"> none.</w:t>
+      </w:r>
+    </w:p>
+    <w:p>
+      <w:pPr>
+        <w:pStyle w:val="Heading1"/>
+      </w:pPr>
+      <w:r>
+        <w:t>p15 · Continuation of p13 — which r give integral exponents · label: — (PW roundel)</w:t>
+      </w:r>
+    </w:p>
+    <w:p>
+      <w:r>
+        <w:rPr>
+          <w:b/>
+        </w:rPr>
+        <w:t>H (all of it):</w:t>
+      </w:r>
+      <w:r>
+        <w:t xml:space="preserve"> green/cyan Tᵣ₊₁ = ²⁰Cᵣ 2^{(160−11r)/12} 3^{−r/4} with ²⁰Cᵣ ringed yellow; yellow leader to r ∈ W, 0 ≤ r ≤ 20; yellow [(160−11r)/12] &amp; [−r/4] → Integer; pink 13 + (4−11r)/12 with a red vertical rule; white test list — left of rule: r=12 ⇒ 13 + (4−132)/12 ✗, r=16 ⇒ 13 + (4−11×16)/12 ✗, r=20 ⇒ 13 + (4−11×20)/12 / 12 then 13−18 ✓; right of rule: r=0 ⇒ 13 + 4/12 ✗, r=4 ⇒ 13 + (4−44)/12 ✗, r=8 ⇒ 13 + (4−88)/12 ✓; yellow → Integer for the first fraction; −r/4 → Integer with yellow '4' is multiple of 4 (the quoted word reads δ-style shorthand) and a red box # r = 0,4,8,12,16,20; a second red box on the right r = 8, 20; white brace → Rational = 2 .</w:t>
+      </w:r>
+    </w:p>
+    <w:p>
+      <w:r>
+        <w:rPr>
+          <w:b/>
+        </w:rPr>
+        <w:t>DIBY:</w:t>
+      </w:r>
+      <w:r>
+        <w:t xml:space="preserve"> none. </w:t>
+      </w:r>
+      <w:r>
+        <w:rPr>
+          <w:b/>
+        </w:rPr>
+        <w:t>U:</w:t>
+      </w:r>
+      <w:r>
+        <w:t xml:space="preserve"> 1 — the short word before "is multiple of 4" is ambiguous handwriting; page 15, right.</w:t>
+      </w:r>
+    </w:p>
+    <w:p>
+      <w:pPr>
+        <w:pStyle w:val="Heading1"/>
+      </w:pPr>
+      <w:r>
+        <w:t>p16 · FINDING RATIONAL &amp; "IVRTATIONAL" TERMS — Question [JEE Mains–2016] · label: Page No. 151</w:t>
+      </w:r>
+    </w:p>
+    <w:p>
+      <w:r>
+        <w:rPr>
+          <w:b/>
+        </w:rPr>
+        <w:t>P:</w:t>
+      </w:r>
+      <w:r>
+        <w:t xml:space="preserve"> chip </w:t>
+      </w:r>
+      <w:r>
+        <w:rPr>
+          <w:b/>
+        </w:rPr>
+        <w:t>FINDING RATIONAL &amp; IVRTTATIONAL TERMS</w:t>
+      </w:r>
+      <w:r>
+        <w:t xml:space="preserve"> — the second word is printed with a typo (letters transposed: "IVRTATIONAL"); recorded as printed, not corrected. Chip </w:t>
+      </w:r>
+      <w:r>
+        <w:rPr>
+          <w:b/>
+        </w:rPr>
+        <w:t>Question [JEE Mains–2016]</w:t>
+      </w:r>
+      <w:r>
+        <w:t xml:space="preserve">; </w:t>
+      </w:r>
+      <w:r>
+        <w:rPr>
+          <w:b/>
+        </w:rPr>
+        <w:t>The total number of irrational terms in the binomial expansion (7^{1/5} − 3^{1/10})^{60} is</w:t>
+      </w:r>
+      <w:r>
+        <w:t xml:space="preserve"> (cyan); options </w:t>
+      </w:r>
+      <w:r>
+        <w:rPr>
+          <w:b/>
+        </w:rPr>
+        <w:t>A 48, B 49, C 54, D 55</w:t>
+      </w:r>
+      <w:r>
+        <w:t>.</w:t>
+      </w:r>
+    </w:p>
+    <w:p>
+      <w:r>
+        <w:rPr>
+          <w:b/>
+        </w:rPr>
+        <w:t>H:</w:t>
+      </w:r>
+      <w:r>
+        <w:t xml:space="preserve"> the question is the same as p10 — yellow Total terms = 60 + 1 = 61 ., green Tᵣ₊₁ = ⁶⁰Cᵣ (7^{1/5})^{60−r} (−3^{1/10})ʳ = ⁶⁰C (7)^{(60−r)/5} (−1)ʳ 3^{r/10} with ≑ marks; pink tick through option </w:t>
+      </w:r>
+      <w:r>
+        <w:rPr>
+          <w:b/>
+        </w:rPr>
+        <w:t>C</w:t>
+      </w:r>
+      <w:r>
+        <w:t>; cyan tick under B→C boundary as drawn.</w:t>
+      </w:r>
+    </w:p>
+    <w:p>
+      <w:r>
+        <w:rPr>
+          <w:b/>
+        </w:rPr>
+        <w:t>DIBY:</w:t>
+      </w:r>
+      <w:r>
+        <w:t xml:space="preserve"> none. </w:t>
       </w:r>
       <w:r>
         <w:rPr>

</xml_diff>

<commit_message>
Twin 1: refresh complete DOCX handoff exports
Co-authored-by: arena-agent <297053741+arena-agent@users.noreply.github.com>
</commit_message>
<xml_diff>
--- a/deliverables/twin-1/transcripts/binomial-theorem-l03.docx
+++ b/deliverables/twin-1/transcripts/binomial-theorem-l03.docx
@@ -1622,6 +1622,1790 @@
       </w:r>
       <w:r>
         <w:t xml:space="preserve"> none.</w:t>
+      </w:r>
+    </w:p>
+    <w:p>
+      <w:pPr>
+        <w:pStyle w:val="Heading1"/>
+      </w:pPr>
+      <w:r>
+        <w:t>p17 · Question [JEE Mains–2020] — 33 integral terms, least n · label: Page No. 152</w:t>
+      </w:r>
+    </w:p>
+    <w:p>
+      <w:r>
+        <w:rPr>
+          <w:b/>
+        </w:rPr>
+        <w:t>P:</w:t>
+      </w:r>
+      <w:r>
+        <w:t xml:space="preserve"> chip </w:t>
+      </w:r>
+      <w:r>
+        <w:rPr>
+          <w:b/>
+        </w:rPr>
+        <w:t>Question [JEE Mains–2020]</w:t>
+      </w:r>
+      <w:r>
+        <w:t xml:space="preserve">; </w:t>
+      </w:r>
+      <w:r>
+        <w:rPr>
+          <w:b/>
+        </w:rPr>
+        <w:t>If the number of integral terms in the expansion of (3^{1/2} + 5^{1/8})ⁿ is exactly 33, then the least value of n is</w:t>
+      </w:r>
+      <w:r>
+        <w:t xml:space="preserve"> — the clause </w:t>
+      </w:r>
+      <w:r>
+        <w:rPr>
+          <w:b/>
+        </w:rPr>
+        <w:t>then the least value of n</w:t>
+      </w:r>
+      <w:r>
+        <w:t xml:space="preserve"> inside a red rectangle, n cyan; options </w:t>
+      </w:r>
+      <w:r>
+        <w:rPr>
+          <w:b/>
+        </w:rPr>
+        <w:t>A 264, B 128, C 256, D 248</w:t>
+      </w:r>
+      <w:r>
+        <w:t>.</w:t>
+      </w:r>
+    </w:p>
+    <w:p>
+      <w:r>
+        <w:rPr>
+          <w:b/>
+        </w:rPr>
+        <w:t>H:</w:t>
+      </w:r>
+      <w:r>
+        <w:t xml:space="preserve"> pink ⁿCᵣ (3^{1/2})^{n−r} (5^{−1/8})ʳ → Tᵣ₊₁ = ⁿCᵣ 3^{(n−r)/2} 5^{r/8}; cyan 0 ≤ r ≤ n; cyan (n−r)/2 = Int &amp; r/8 = Int; yellow (n/2 − r/2) = Int with n/2, r/2 ringed pink; pink list r = 0, 8, 16, 24 ……, 8×32 under a "33 Terms" arc with 8×0 8×1 8×2 8×3 sub-labels → 256 double-underlined; cyan r = 0,8,16,24,32,40 … … to a white-circled 256; pink n = [256] (red box) , 258, 260, 262, (264) with 264 crossed ✗; pink n → even wavy; white tick through option </w:t>
+      </w:r>
+      <w:r>
+        <w:rPr>
+          <w:b/>
+        </w:rPr>
+        <w:t>C</w:t>
+      </w:r>
+      <w:r>
+        <w:t>.</w:t>
+      </w:r>
+    </w:p>
+    <w:p>
+      <w:r>
+        <w:rPr>
+          <w:b/>
+        </w:rPr>
+        <w:t>DIBY:</w:t>
+      </w:r>
+      <w:r>
+        <w:t xml:space="preserve"> none. </w:t>
+      </w:r>
+      <w:r>
+        <w:rPr>
+          <w:b/>
+        </w:rPr>
+        <w:t>U:</w:t>
+      </w:r>
+      <w:r>
+        <w:t xml:space="preserve"> none.</w:t>
+      </w:r>
+    </w:p>
+    <w:p>
+      <w:pPr>
+        <w:pStyle w:val="Heading1"/>
+      </w:pPr>
+      <w:r>
+        <w:t>p18 · Question [JEE Mains–2024] — 824th power, integral terms (DIBY-A) · label: — (chip only)</w:t>
+      </w:r>
+    </w:p>
+    <w:p>
+      <w:r>
+        <w:rPr>
+          <w:b/>
+        </w:rPr>
+        <w:t>P:</w:t>
+      </w:r>
+      <w:r>
+        <w:t xml:space="preserve"> chip </w:t>
+      </w:r>
+      <w:r>
+        <w:rPr>
+          <w:b/>
+        </w:rPr>
+        <w:t>Question [JEE Mains–2024]</w:t>
+      </w:r>
+      <w:r>
+        <w:t xml:space="preserve">; </w:t>
+      </w:r>
+      <w:r>
+        <w:rPr>
+          <w:b/>
+        </w:rPr>
+        <w:t>Number of integral terms in the expansion of {7^{(1/2)} + 11^{(1/6)}}^{824} is equal to _________</w:t>
+      </w:r>
+      <w:r>
+        <w:t xml:space="preserve"> (the braces/exponents cyan) — printed </w:t>
+      </w:r>
+      <w:r>
+        <w:rPr>
+          <w:b/>
+        </w:rPr>
+        <w:t>Ans: 138</w:t>
+      </w:r>
+      <w:r>
+        <w:t xml:space="preserve"> (138 green).</w:t>
+      </w:r>
+    </w:p>
+    <w:p>
+      <w:r>
+        <w:rPr>
+          <w:b/>
+        </w:rPr>
+        <w:t>H:</w:t>
+      </w:r>
+      <w:r>
+        <w:t xml:space="preserve"> white # DIBY∘ — Ⓐ (A inside a circle) with a double wavy underline — the teacher's own DIBY tag; no working on the slide.</w:t>
+      </w:r>
+    </w:p>
+    <w:p>
+      <w:r>
+        <w:rPr>
+          <w:b/>
+        </w:rPr>
+        <w:t>DIBY:</w:t>
+      </w:r>
+      <w:r>
+        <w:t xml:space="preserve"> YES — handwritten DIBY — (A); no printed label → internal ID BT-L03-P18-DIBY-INT-01 (internal). </w:t>
+      </w:r>
+      <w:r>
+        <w:rPr>
+          <w:b/>
+        </w:rPr>
+        <w:t>U:</w:t>
+      </w:r>
+      <w:r>
+        <w:t xml:space="preserve"> none.</w:t>
+      </w:r>
+    </w:p>
+    <w:p>
+      <w:pPr>
+        <w:pStyle w:val="Heading1"/>
+      </w:pPr>
+      <w:r>
+        <w:t>p19 · RAPID FIRE ROUND — four coefficient blanks, all filled on the board · label: — (chip only)</w:t>
+      </w:r>
+    </w:p>
+    <w:p>
+      <w:r>
+        <w:rPr>
+          <w:b/>
+        </w:rPr>
+        <w:t>P:</w:t>
+      </w:r>
+      <w:r>
+        <w:t xml:space="preserve"> chip </w:t>
+      </w:r>
+      <w:r>
+        <w:rPr>
+          <w:b/>
+        </w:rPr>
+        <w:t>RAPID FIRE ROUND</w:t>
+      </w:r>
+      <w:r>
+        <w:t xml:space="preserve">; </w:t>
+      </w:r>
+      <w:r>
+        <w:rPr>
+          <w:b/>
+        </w:rPr>
+        <w:t>1.</w:t>
+      </w:r>
+      <w:r>
+        <w:t xml:space="preserve"> Coefficient of x^r in (1 + x)ⁿ is _____. </w:t>
+      </w:r>
+      <w:r>
+        <w:rPr>
+          <w:b/>
+        </w:rPr>
+        <w:t>2.</w:t>
+      </w:r>
+      <w:r>
+        <w:t xml:space="preserve"> Coefficient of x⁹ in (1 + 3x + 3x² + x³)¹⁵ is _____. </w:t>
+      </w:r>
+      <w:r>
+        <w:rPr>
+          <w:b/>
+        </w:rPr>
+        <w:t>3.</w:t>
+      </w:r>
+      <w:r>
+        <w:t xml:space="preserve"> Coefficient of x¹⁰ in x³(2 − 3x)⁹ is _____. </w:t>
+      </w:r>
+      <w:r>
+        <w:rPr>
+          <w:b/>
+        </w:rPr>
+        <w:t>4.</w:t>
+      </w:r>
+      <w:r>
+        <w:t xml:space="preserve"> Coefficient of x¹⁰ in (2x+5)¹⁷/x⁴ is _____.</w:t>
+      </w:r>
+    </w:p>
+    <w:p>
+      <w:r>
+        <w:rPr>
+          <w:b/>
+        </w:rPr>
+        <w:t>H (answers written into the blanks):</w:t>
+      </w:r>
+      <w:r>
+        <w:t xml:space="preserve"> 1 → green ⁿCᵣ (wavy, leader to green ⁿC xʳ); 2 → orange ⁴⁵C₉; 3 → orange/pink ⁹C₇ 2² 3⁷; 4 → cyan coeff. of x¹⁴ in (2x+5)¹⁷ then pink ¹⁷C₃ 2¹⁴ 5³; supporting work: magenta ¹⁷C (2x)^{14−r} 5^r = x^{14−r} with 14−r ringed; orange ((1+x)³)^{15} = (1+x)^{45} → ⁴⁵Cᵣ x^r (x^r ringed); white leader from item 4 down to coeff of x¹⁰ in x³(2−3x)⁹ = coeff of x⁷ in (2−3x)⁹ — the x³(2−3x)⁹ inside a red rectangle with a green x⁷ below it, and yellow ⁹Cᵣ 2^{9−r}(−3)^r x^r (x^r ringed).</w:t>
+      </w:r>
+    </w:p>
+    <w:p>
+      <w:r>
+        <w:rPr>
+          <w:b/>
+        </w:rPr>
+        <w:t>DIBY:</w:t>
+      </w:r>
+      <w:r>
+        <w:t xml:space="preserve"> none. </w:t>
+      </w:r>
+      <w:r>
+        <w:rPr>
+          <w:b/>
+        </w:rPr>
+        <w:t>U:</w:t>
+      </w:r>
+      <w:r>
+        <w:t xml:space="preserve"> none.</w:t>
+      </w:r>
+    </w:p>
+    <w:p>
+      <w:pPr>
+        <w:pStyle w:val="Heading1"/>
+      </w:pPr>
+      <w:r>
+        <w:t>p20 · Blue बादल (KPNCC) rule card · label: — (PW roundel)</w:t>
+      </w:r>
+    </w:p>
+    <w:p>
+      <w:r>
+        <w:rPr>
+          <w:b/>
+        </w:rPr>
+        <w:t>P:</w:t>
+      </w:r>
+      <w:r>
+        <w:t xml:space="preserve"> inside a blue cloud outlined yellow: </w:t>
+      </w:r>
+      <w:r>
+        <w:rPr>
+          <w:b/>
+        </w:rPr>
+        <w:t>Blue बादल (KPNCC)</w:t>
+      </w:r>
+      <w:r>
+        <w:t xml:space="preserve"> (white; Devanagari "बादल" = cloud) · </w:t>
+      </w:r>
+      <w:r>
+        <w:rPr>
+          <w:b/>
+        </w:rPr>
+        <w:t>Before finding coefficient</w:t>
+      </w:r>
+      <w:r>
+        <w:t xml:space="preserve"> (white, red rectangle) · </w:t>
+      </w:r>
+      <w:r>
+        <w:rPr>
+          <w:b/>
+        </w:rPr>
+        <w:t>Always simplify → Given expression</w:t>
+      </w:r>
+      <w:r>
+        <w:t xml:space="preserve"> (yellow). Acronym printed "KPNCC" — kept as printed.</w:t>
+      </w:r>
+    </w:p>
+    <w:p>
+      <w:r>
+        <w:rPr>
+          <w:b/>
+        </w:rPr>
+        <w:t>H:</w:t>
+      </w:r>
+      <w:r>
+        <w:t xml:space="preserve"> none. </w:t>
+      </w:r>
+      <w:r>
+        <w:rPr>
+          <w:b/>
+        </w:rPr>
+        <w:t>DIBY:</w:t>
+      </w:r>
+      <w:r>
+        <w:t xml:space="preserve"> none. </w:t>
+      </w:r>
+      <w:r>
+        <w:rPr>
+          <w:b/>
+        </w:rPr>
+        <w:t>U:</w:t>
+      </w:r>
+      <w:r>
+        <w:t xml:space="preserve"> none.</w:t>
+      </w:r>
+    </w:p>
+    <w:p>
+      <w:pPr>
+        <w:pStyle w:val="Heading1"/>
+      </w:pPr>
+      <w:r>
+        <w:t>p21 · Acidic Question — (1+x+x²+x³)¹⁵, find a₅ (DIBY-B) · label: Page No. 152</w:t>
+      </w:r>
+    </w:p>
+    <w:p>
+      <w:r>
+        <w:rPr>
+          <w:b/>
+        </w:rPr>
+        <w:t>P:</w:t>
+      </w:r>
+      <w:r>
+        <w:t xml:space="preserve"> chip </w:t>
+      </w:r>
+      <w:r>
+        <w:rPr>
+          <w:b/>
+        </w:rPr>
+        <w:t>Acidic Question</w:t>
+      </w:r>
+      <w:r>
+        <w:t xml:space="preserve">; </w:t>
+      </w:r>
+      <w:r>
+        <w:rPr>
+          <w:b/>
+        </w:rPr>
+        <w:t>If (1 + x + x² + x³)¹⁵ = a₀ + a₁x + a₂ x² + …., then find a₅ &amp; also find total number of terms.</w:t>
+      </w:r>
+      <w:r>
+        <w:t xml:space="preserve"> — the quartic bracket green inside a red rectangle, a₅ cyan.</w:t>
+      </w:r>
+    </w:p>
+    <w:p>
+      <w:r>
+        <w:rPr>
+          <w:b/>
+        </w:rPr>
+        <w:t>H:</w:t>
+      </w:r>
+      <w:r>
+        <w:t xml:space="preserve"> cyan tick above the prompt; pink circle round a₅ with a pink leader to coeff. of x⁵; orange ((1+x+x²(1+x))¹⁵ = ((1+x)(1+x²))¹⁵ (wavy under 1+x and x²(1+x)); white coeff. of x⁵ → orange (1+x)¹⁵ · (1+x²)¹⁵; cyan DIBY∘ — Ⓑ (B circled) with a cyan arrow to a₇ = pink-in-red-box coeff. of x⁷.</w:t>
+      </w:r>
+    </w:p>
+    <w:p>
+      <w:r>
+        <w:rPr>
+          <w:b/>
+        </w:rPr>
+        <w:t>DIBY:</w:t>
+      </w:r>
+      <w:r>
+        <w:t xml:space="preserve"> YES — handwritten DIBY — (B); internal ID BT-L03-P21-DIBY-INT-02 (internal). </w:t>
+      </w:r>
+      <w:r>
+        <w:rPr>
+          <w:b/>
+        </w:rPr>
+        <w:t>U:</w:t>
+      </w:r>
+      <w:r>
+        <w:t xml:space="preserve"> none.</w:t>
+      </w:r>
+    </w:p>
+    <w:p>
+      <w:pPr>
+        <w:pStyle w:val="Heading1"/>
+      </w:pPr>
+      <w:r>
+        <w:t>p22 · Coefficient of x⁵ in (1+x)¹⁵(1+x²)¹⁵ · label: — (PW roundel)</w:t>
+      </w:r>
+    </w:p>
+    <w:p>
+      <w:r>
+        <w:rPr>
+          <w:b/>
+        </w:rPr>
+        <w:t>H (all of it, split by a white dashed rule):</w:t>
+      </w:r>
+      <w:r>
+        <w:t xml:space="preserve"> left — cyan ¹⁵C x^{ⓡ} underbraced; white coeff. of x⁵ → with (1+x)¹⁵ in a cyan cloud and (1+x²)¹⁵ beside it; three cyan/orange pairings ¹⁵C₅ x⁵ × ¹⁵C₀ x⁰ = ¹⁵C₅ ×1 x⁵, ¹⁵C₃ x³ × ¹⁵C₁ x² = ¹⁵C₃ ¹⁵C₁ x⁵, ¹⁵C₁ x⁴ × ¹⁵C₂ x⁴ = ¹⁵C₁ ¹⁵C₂ x⁵ (the third's first exponent written x⁴ as drawn, see U); yellow brace → red box (¹⁵C₅ + ¹⁵C₃¹⁵C₁ + ¹⁵C₁¹⁵C₂) x⁵ with a cyan fnf leader below; right — orange (1+x²)¹⁵ → white ¹⁵Cᵣ (x²)^r → ¹⁵C₀ + ¹⁵C₁x² + ¹⁵C₂x⁴ + ¹⁵C₃x⁶ …….</w:t>
+      </w:r>
+    </w:p>
+    <w:p>
+      <w:r>
+        <w:rPr>
+          <w:b/>
+        </w:rPr>
+        <w:t>DIBY:</w:t>
+      </w:r>
+      <w:r>
+        <w:t xml:space="preserve"> none. </w:t>
+      </w:r>
+      <w:r>
+        <w:rPr>
+          <w:b/>
+        </w:rPr>
+        <w:t>U:</w:t>
+      </w:r>
+      <w:r>
+        <w:t xml:space="preserve"> 1 — third pairing written ¹⁵C₁ x⁴ × though the pattern requires x¹; transcribed as drawn. Page 22, left block.</w:t>
+      </w:r>
+    </w:p>
+    <w:p>
+      <w:pPr>
+        <w:pStyle w:val="Heading1"/>
+      </w:pPr>
+      <w:r>
+        <w:t>p23 · Same Acidic Question with options — total number of terms = 46 · label: Page No. 152</w:t>
+      </w:r>
+    </w:p>
+    <w:p>
+      <w:r>
+        <w:rPr>
+          <w:b/>
+        </w:rPr>
+        <w:t>P:</w:t>
+      </w:r>
+      <w:r>
+        <w:t xml:space="preserve"> chip </w:t>
+      </w:r>
+      <w:r>
+        <w:rPr>
+          <w:b/>
+        </w:rPr>
+        <w:t>Acidic Question</w:t>
+      </w:r>
+      <w:r>
+        <w:t>; identical printed stem to p21 but here a₅ is cyan with no red rectangle on the bracket… (bracket still green, red rectangle still present).</w:t>
+      </w:r>
+    </w:p>
+    <w:p>
+      <w:r>
+        <w:rPr>
+          <w:b/>
+        </w:rPr>
+        <w:t>H:</w:t>
+      </w:r>
+      <w:r>
+        <w:t xml:space="preserve"> pink options written at left Ⓐ 16², Ⓑ 32, Ⓒ 46, Ⓓ 52 — green ✗ through A and B, green double-tick on C; green ((1+x+x²+x³)¹⁵ = (1+x)¹⁵ · (1+x²)¹⁵; green leader to red box (1+x+x²+x³)¹⁵ = a₀ + a₁x + a₂x² + … … + a₄₅x⁴⁵; yellow T.T. = (46) circled + tick; white cloud N.O.T. = (max. power + 1) (provided all terms should be present).</w:t>
+      </w:r>
+    </w:p>
+    <w:p>
+      <w:r>
+        <w:rPr>
+          <w:b/>
+        </w:rPr>
+        <w:t>DIBY:</w:t>
+      </w:r>
+      <w:r>
+        <w:t xml:space="preserve"> none (the DIBY-B tag from p21 is not repeated here). </w:t>
+      </w:r>
+      <w:r>
+        <w:rPr>
+          <w:b/>
+        </w:rPr>
+        <w:t>U:</w:t>
+      </w:r>
+      <w:r>
+        <w:t xml:space="preserve"> none.</w:t>
+      </w:r>
+    </w:p>
+    <w:p>
+      <w:pPr>
+        <w:pStyle w:val="Heading1"/>
+      </w:pPr>
+      <w:r>
+        <w:t>p24 · Same problem with x → x² substitution: T.T. 46 vs 91 · label: — (PW roundel)</w:t>
+      </w:r>
+    </w:p>
+    <w:p>
+      <w:r>
+        <w:rPr>
+          <w:b/>
+        </w:rPr>
+        <w:t>H (all of it):</w:t>
+      </w:r>
+      <w:r>
+        <w:t xml:space="preserve"> green (1+x+x²+x³)¹⁵ = red box a₀ + a₁x + a₂x² + … … + a₄₅x⁴⁵, yellow leader to T.T. = (46) circled + tick; pink red box x → x²; pink (1+x²+x⁴+x⁶)¹⁵ = a₀ + a₁x² + a₂x⁴ + … … + a₄₅x⁹⁰; pink leader down to T.T. = 91 ✗ and T.T. = 46 ✓.</w:t>
+      </w:r>
+    </w:p>
+    <w:p>
+      <w:r>
+        <w:rPr>
+          <w:b/>
+        </w:rPr>
+        <w:t>DIBY:</w:t>
+      </w:r>
+      <w:r>
+        <w:t xml:space="preserve"> none. </w:t>
+      </w:r>
+      <w:r>
+        <w:rPr>
+          <w:b/>
+        </w:rPr>
+        <w:t>U:</w:t>
+      </w:r>
+      <w:r>
+        <w:t xml:space="preserve"> none.</w:t>
+      </w:r>
+    </w:p>
+    <w:p>
+      <w:pPr>
+        <w:pStyle w:val="Heading1"/>
+      </w:pPr>
+      <w:r>
+        <w:t>p25 · Continuation: coeff. of x³⁷ and x⁰ in (1+x)¹⁵(1+x²)¹⁵ (fill-in gaps) · label: — (PW roundel)</w:t>
+      </w:r>
+    </w:p>
+    <w:p>
+      <w:r>
+        <w:rPr>
+          <w:b/>
+        </w:rPr>
+        <w:t>H (all of it):</w:t>
+      </w:r>
+      <w:r>
+        <w:t xml:space="preserve"> far left cyan ¹⁵C x^{ⓡ} underbraced with a cyan leader from the cloud; centre white coeff. of x^{37} → orange (1+x)¹⁵ (1+x²)¹⁵ — (1+x)¹⁵ inside a cyan cloud — two yellow leaders down to ___ x⁷ × ___ x³⁰ (blanks left unfilled); right white coeff. of x⁰ → orange (1+x)¹⁵ (1+x²)¹⁵ with (1+x)¹⁵ in a cyan cloud → yellow leaders to ~~~ x⁰ × ~~~ x⁰. The blank underlines are the questions the teacher leaves to the class (x⁷·x³⁰ is impossible in this product — max is x¹⁵·x³⁰ = x⁴⁵ with x¹⁵·x³⁰ only if 1+x is taken to power 15; left exactly as written).</w:t>
+      </w:r>
+    </w:p>
+    <w:p>
+      <w:r>
+        <w:rPr>
+          <w:b/>
+        </w:rPr>
+        <w:t>DIBY:</w:t>
+      </w:r>
+      <w:r>
+        <w:t xml:space="preserve"> none. </w:t>
+      </w:r>
+      <w:r>
+        <w:rPr>
+          <w:b/>
+        </w:rPr>
+        <w:t>U:</w:t>
+      </w:r>
+      <w:r>
+        <w:t xml:space="preserve"> 1 — coeff. of x^{37} with the pair x⁷ × x³⁰: no such split exists for (1+x)¹⁵(1+x²)¹⁵ (x⁷ needs 7 from the first factor, x³⁰ needs 15 from the second — arithmetically fine, 7+30 = 37, so the item is consistent; recorded only because the blanks are never filled in on the slide). Page 25, both blocks.</w:t>
+      </w:r>
+    </w:p>
+    <w:p>
+      <w:pPr>
+        <w:pStyle w:val="Heading1"/>
+      </w:pPr>
+      <w:r>
+        <w:t>p26 · Question [JEE Mains–2022] — term independent of x · label: Page No. 152 (repeat of the p21–25 label)</w:t>
+      </w:r>
+    </w:p>
+    <w:p>
+      <w:r>
+        <w:rPr>
+          <w:b/>
+        </w:rPr>
+        <w:t>P:</w:t>
+      </w:r>
+      <w:r>
+        <w:t xml:space="preserve"> chip </w:t>
+      </w:r>
+      <w:r>
+        <w:rPr>
+          <w:b/>
+        </w:rPr>
+        <w:t>Question [JEE Mains–2022]</w:t>
+      </w:r>
+      <w:r>
+        <w:t xml:space="preserve">; </w:t>
+      </w:r>
+      <w:r>
+        <w:rPr>
+          <w:b/>
+        </w:rPr>
+        <w:t>The term independent of x in the expression of (1 − x² + 3x³)( (5/2)x³ − 1/(5x²) )¹¹, x ≠ 0 is</w:t>
+      </w:r>
+      <w:r>
+        <w:t xml:space="preserve"> — the product (1 − x² + 3x³)(…) green inside a red rectangle; options </w:t>
+      </w:r>
+      <w:r>
+        <w:rPr>
+          <w:b/>
+        </w:rPr>
+        <w:t>A 7/40, B 33/200, C 39/200, D 11/50</w:t>
+      </w:r>
+      <w:r>
+        <w:t xml:space="preserve">; white tick through </w:t>
+      </w:r>
+      <w:r>
+        <w:rPr>
+          <w:b/>
+        </w:rPr>
+        <w:t>B</w:t>
+      </w:r>
+      <w:r>
+        <w:t>.</w:t>
+      </w:r>
+    </w:p>
+    <w:p>
+      <w:r>
+        <w:rPr>
+          <w:b/>
+        </w:rPr>
+        <w:t>H:</w:t>
+      </w:r>
+      <w:r>
+        <w:t xml:space="preserve"> orange coeff of x⁰ with x⁰ in a cyan double-underlined circle; magenta T_{r+1} = ¹¹Cᵣ (5x³/2)^{11−r} (−1/(5x²))^r = [¹¹Cᵣ (5/2)^{11−r} (−1/5)^r x^{33−5r}] (the bracket in a red rectangle) with r ∈ W, 0 ≤ r ≤ 11 below; three orange/green product lines: 1 x⁰ × O x⁰ = O x⁰, −1 x² × ¹¹C₄ (5/2)⁴ (−1/5)⁷ x⁻² = + ¹¹C₄ (5/2)⁴ · 1/5⁷ x⁰ (the right-hand side in a red rectangle), 3 x³ × O x⁻³ = O x⁰; cyan cancellation ladder 11C₄ × 3×11 / 16 → 8 with 10 and 125/… struck, ending in a cyan circle (33/200).</w:t>
+      </w:r>
+    </w:p>
+    <w:p>
+      <w:r>
+        <w:rPr>
+          <w:b/>
+        </w:rPr>
+        <w:t>DIBY:</w:t>
+      </w:r>
+      <w:r>
+        <w:t xml:space="preserve"> none. </w:t>
+      </w:r>
+      <w:r>
+        <w:rPr>
+          <w:b/>
+        </w:rPr>
+        <w:t>U:</w:t>
+      </w:r>
+      <w:r>
+        <w:t xml:space="preserve"> none (printed page label 152 re-used from p21–25; PDF page 26 kept as the key).</w:t>
+      </w:r>
+    </w:p>
+    <w:p>
+      <w:pPr>
+        <w:pStyle w:val="Heading1"/>
+      </w:pPr>
+      <w:r>
+        <w:t>p27 · Coefficient of x⁵ in (1+x²)⁷(2+x³)⁵ — board recap · label: — (PW roundel)</w:t>
+      </w:r>
+    </w:p>
+    <w:p>
+      <w:r>
+        <w:rPr>
+          <w:b/>
+        </w:rPr>
+        <w:t>H (all of it):</w:t>
+      </w:r>
+      <w:r>
+        <w:t xml:space="preserve"> white lists arced down to the two factors: x⁰, x², x⁴, x⁶, x⁸ …… for (1+x²)⁷ and x⁰, x³, x⁵, x⁹, x¹² …… for (2+x³)⁵; cyan # coeff. of x⁵ → (1+x²)⁷ · (2+x³)⁵; orange ⁷C₁ x² × ⁵C₁ 2⁴ x³ = (35 × 16) x⁵ with a green tick; two red boxes at the bottom, each holding the generic term: green (1+x²)⁷  ⁷Cᵣ (x²)^r and green (2+x³)⁵ ↷ ⁵Cᵣ 2^{5−r}(x³)^r.</w:t>
+      </w:r>
+    </w:p>
+    <w:p>
+      <w:r>
+        <w:rPr>
+          <w:b/>
+        </w:rPr>
+        <w:t>DIBY:</w:t>
+      </w:r>
+      <w:r>
+        <w:t xml:space="preserve"> none. </w:t>
+      </w:r>
+      <w:r>
+        <w:rPr>
+          <w:b/>
+        </w:rPr>
+        <w:t>U:</w:t>
+      </w:r>
+      <w:r>
+        <w:t xml:space="preserve"> 1 — second power list written x⁰, x³, x⁵, x⁹, x¹²; the third entry should be x⁶; transcribed as drawn (open-top ⁵/ hazard). Page 27, top-right list.</w:t>
+      </w:r>
+    </w:p>
+    <w:p>
+      <w:pPr>
+        <w:pStyle w:val="Heading1"/>
+      </w:pPr>
+      <w:r>
+        <w:t>p28 · Question [JEE (Adv.)–2014] — coefficient of x¹¹, marked H.W. · label: Page No. 153</w:t>
+      </w:r>
+    </w:p>
+    <w:p>
+      <w:r>
+        <w:rPr>
+          <w:b/>
+        </w:rPr>
+        <w:t>P:</w:t>
+      </w:r>
+      <w:r>
+        <w:t xml:space="preserve"> chip </w:t>
+      </w:r>
+      <w:r>
+        <w:rPr>
+          <w:b/>
+        </w:rPr>
+        <w:t>Question [JEE (Adv.)–2014]</w:t>
+      </w:r>
+      <w:r>
+        <w:t xml:space="preserve">; </w:t>
+      </w:r>
+      <w:r>
+        <w:rPr>
+          <w:b/>
+        </w:rPr>
+        <w:t>Coefficient of x¹¹ in the expansion of (1 + x²)⁴ (1 + x³)⁷ (1 + x⁴)¹² is</w:t>
+      </w:r>
+      <w:r>
+        <w:t xml:space="preserve"> — the trinomial product cyan, x¹¹ green; options </w:t>
+      </w:r>
+      <w:r>
+        <w:rPr>
+          <w:b/>
+        </w:rPr>
+        <w:t>A 1051, B 1106, C 1113, D 1120</w:t>
+      </w:r>
+      <w:r>
+        <w:t>.</w:t>
+      </w:r>
+    </w:p>
+    <w:p>
+      <w:r>
+        <w:rPr>
+          <w:b/>
+        </w:rPr>
+        <w:t>H:</w:t>
+      </w:r>
+      <w:r>
+        <w:t xml:space="preserve"> green H.W. inside a hand-drawn circle with a double underline and two dots — no working, the question is left as homework.</w:t>
+      </w:r>
+    </w:p>
+    <w:p>
+      <w:r>
+        <w:rPr>
+          <w:b/>
+        </w:rPr>
+        <w:t>DIBY:</w:t>
+      </w:r>
+      <w:r>
+        <w:t xml:space="preserve"> none (H.W. tag only). </w:t>
+      </w:r>
+      <w:r>
+        <w:rPr>
+          <w:b/>
+        </w:rPr>
+        <w:t>U:</w:t>
+      </w:r>
+      <w:r>
+        <w:t xml:space="preserve"> none.</w:t>
+      </w:r>
+    </w:p>
+    <w:p>
+      <w:pPr>
+        <w:pStyle w:val="Heading1"/>
+      </w:pPr>
+      <w:r>
+        <w:t>p29 · Question [JEE Mains–2024] — constant term p, find 108p (H.W. + DIBY) · label: — (chip only)</w:t>
+      </w:r>
+    </w:p>
+    <w:p>
+      <w:r>
+        <w:rPr>
+          <w:b/>
+        </w:rPr>
+        <w:t>P:</w:t>
+      </w:r>
+      <w:r>
+        <w:t xml:space="preserve"> chip </w:t>
+      </w:r>
+      <w:r>
+        <w:rPr>
+          <w:b/>
+        </w:rPr>
+        <w:t>Question [JEE Mains–2024]</w:t>
+      </w:r>
+      <w:r>
+        <w:t xml:space="preserve">; </w:t>
+      </w:r>
+      <w:r>
+        <w:rPr>
+          <w:b/>
+        </w:rPr>
+        <w:t>If the constant term is expansion of (1 + 2x − 3x³)( (3/2)x² − 1/(3x) )⁹ is p, then 108p is equal to</w:t>
+      </w:r>
+      <w:r>
+        <w:t xml:space="preserve"> — green product, cyan 108p ("is expansion of" as printed, no "in").</w:t>
+      </w:r>
+    </w:p>
+    <w:p>
+      <w:r>
+        <w:rPr>
+          <w:b/>
+        </w:rPr>
+        <w:t>H:</w:t>
+      </w:r>
+      <w:r>
+        <w:t xml:space="preserve"> green H.W. in a circle with double underline, and below it green 90%. DIBY with a wavy underline.</w:t>
+      </w:r>
+    </w:p>
+    <w:p>
+      <w:r>
+        <w:rPr>
+          <w:b/>
+        </w:rPr>
+        <w:t>DIBY:</w:t>
+      </w:r>
+      <w:r>
+        <w:t xml:space="preserve"> YES — handwritten 90%. DIBY; internal ID BT-L03-P29-DIBY-INT-04 (internal). </w:t>
+      </w:r>
+      <w:r>
+        <w:rPr>
+          <w:b/>
+        </w:rPr>
+        <w:t>U:</w:t>
+      </w:r>
+      <w:r>
+        <w:t xml:space="preserve"> none.</w:t>
+      </w:r>
+    </w:p>
+    <w:p>
+      <w:pPr>
+        <w:pStyle w:val="Heading1"/>
+      </w:pPr>
+      <w:r>
+        <w:t>p30 · Section title card: DO IT BY YOURSELF (DIBY) · label: — (PW roundel)</w:t>
+      </w:r>
+    </w:p>
+    <w:p>
+      <w:r>
+        <w:rPr>
+          <w:b/>
+        </w:rPr>
+        <w:t>P:</w:t>
+      </w:r>
+      <w:r>
+        <w:t xml:space="preserve"> dead-centre amber capsule, black text </w:t>
+      </w:r>
+      <w:r>
+        <w:rPr>
+          <w:b/>
+        </w:rPr>
+        <w:t>DO IT BY YOURSELF (DIBY)</w:t>
+      </w:r>
+      <w:r>
+        <w:t xml:space="preserve"> — the only printed expansion of the acronym in this lecture; nothing else on the slide.</w:t>
+      </w:r>
+    </w:p>
+    <w:p>
+      <w:r>
+        <w:rPr>
+          <w:b/>
+        </w:rPr>
+        <w:t>H:</w:t>
+      </w:r>
+      <w:r>
+        <w:t xml:space="preserve"> none. </w:t>
+      </w:r>
+      <w:r>
+        <w:rPr>
+          <w:b/>
+        </w:rPr>
+        <w:t>DIBY:</w:t>
+      </w:r>
+      <w:r>
+        <w:t xml:space="preserve"> the card itself (no item attached). </w:t>
+      </w:r>
+      <w:r>
+        <w:rPr>
+          <w:b/>
+        </w:rPr>
+        <w:t>U:</w:t>
+      </w:r>
+      <w:r>
+        <w:t xml:space="preserve"> none.</w:t>
+      </w:r>
+    </w:p>
+    <w:p>
+      <w:pPr>
+        <w:pStyle w:val="Heading1"/>
+      </w:pPr>
+      <w:r>
+        <w:t>p31 · Printed # DIBY-01/02/03 block (Rapid-Fire answers on board) · label: — (PW roundel)</w:t>
+      </w:r>
+    </w:p>
+    <w:p>
+      <w:r>
+        <w:rPr>
+          <w:b/>
+        </w:rPr>
+        <w:t>P:</w:t>
+      </w:r>
+      <w:r>
+        <w:t xml:space="preserve"> three items, each headed by a green # DIBY-0N tag:</w:t>
+      </w:r>
+    </w:p>
+    <w:p>
+      <w:pPr>
+        <w:pStyle w:val="ListBullet"/>
+      </w:pPr>
+      <w:r>
+        <w:rPr>
+          <w:b/>
+        </w:rPr>
+        <w:t>DIBY-01</w:t>
+      </w:r>
+      <w:r>
+        <w:t xml:space="preserve"> — </w:t>
+      </w:r>
+      <w:r>
+        <w:rPr>
+          <w:b/>
+        </w:rPr>
+        <w:t>The coefficient of x⁻⁶ in the expansion of (4x/5 + 5/(2x²))⁹, is ____</w:t>
+      </w:r>
+      <w:r>
+        <w:t xml:space="preserve"> · yellow </w:t>
+      </w:r>
+      <w:r>
+        <w:rPr>
+          <w:b/>
+        </w:rPr>
+        <w:t>[JEE Mains–2023]</w:t>
+      </w:r>
+      <w:r>
+        <w:t xml:space="preserve"> · </w:t>
+      </w:r>
+      <w:r>
+        <w:rPr>
+          <w:b/>
+        </w:rPr>
+        <w:t>Ans. : 5040</w:t>
+      </w:r>
+      <w:r>
+        <w:t>.</w:t>
+      </w:r>
+    </w:p>
+    <w:p>
+      <w:pPr>
+        <w:pStyle w:val="ListBullet"/>
+      </w:pPr>
+      <w:r>
+        <w:rPr>
+          <w:b/>
+        </w:rPr>
+        <w:t>DIBY-02</w:t>
+      </w:r>
+      <w:r>
+        <w:t xml:space="preserve"> — </w:t>
+      </w:r>
+      <w:r>
+        <w:rPr>
+          <w:b/>
+        </w:rPr>
+        <w:t>The natural number m, for which the coefficient of x in the binomial expansion of (xᵐ + 1/x²)²² is 1540, is ______</w:t>
+      </w:r>
+      <w:r>
+        <w:t xml:space="preserve"> · </w:t>
+      </w:r>
+      <w:r>
+        <w:rPr>
+          <w:b/>
+        </w:rPr>
+        <w:t>[JEE Mains–2020]</w:t>
+      </w:r>
+      <w:r>
+        <w:t xml:space="preserve"> · </w:t>
+      </w:r>
+      <w:r>
+        <w:rPr>
+          <w:b/>
+        </w:rPr>
+        <w:t>Ans. : 13</w:t>
+      </w:r>
+      <w:r>
+        <w:t>.</w:t>
+      </w:r>
+    </w:p>
+    <w:p>
+      <w:pPr>
+        <w:pStyle w:val="ListBullet"/>
+      </w:pPr>
+      <w:r>
+        <w:rPr>
+          <w:b/>
+        </w:rPr>
+        <w:t>DIBY-03</w:t>
+      </w:r>
+      <w:r>
+        <w:t xml:space="preserve"> — </w:t>
+      </w:r>
+      <w:r>
+        <w:rPr>
+          <w:b/>
+        </w:rPr>
+        <w:t>The sum of the real values of x for which the middle term in the binomial expansion of (x³/3 + 3/x)⁸ equals 5670 is</w:t>
+      </w:r>
+      <w:r>
+        <w:t xml:space="preserve"> · </w:t>
+      </w:r>
+      <w:r>
+        <w:rPr>
+          <w:b/>
+        </w:rPr>
+        <w:t>(A) 0 (B) 8 (C) 6 (D) 4</w:t>
+      </w:r>
+      <w:r>
+        <w:t xml:space="preserve"> · </w:t>
+      </w:r>
+      <w:r>
+        <w:rPr>
+          <w:b/>
+        </w:rPr>
+        <w:t>[JEE Mains–2019]</w:t>
+      </w:r>
+      <w:r>
+        <w:t xml:space="preserve"> · </w:t>
+      </w:r>
+      <w:r>
+        <w:rPr>
+          <w:b/>
+        </w:rPr>
+        <w:t>Ans. : (A)</w:t>
+      </w:r>
+      <w:r>
+        <w:t>.</w:t>
+      </w:r>
+    </w:p>
+    <w:p>
+      <w:r>
+        <w:rPr>
+          <w:b/>
+        </w:rPr>
+        <w:t>H:</w:t>
+      </w:r>
+      <w:r>
+        <w:t xml:space="preserve"> orange r = 21 ↦ m = 43 and r = 19 ↦  = 13 (circled) at the top; # ⓜ = (2r+1)/(22−r), r ∈ W, 0 ≤ r ≤ 22 double-underlined; for DIBY-02 ²²Cᵣ (x)^{22−r} (1/x²)^r = ²²Cᵣ x^{22m−rm−2r} with the exponent inside a red rectangle → 22m − rm − 2r = 1, ²²Cᵣ = 1540; for DIBY-03 T₅ = ⁸C₄ (x^{12} 3⁴)/(3⁴ x⁴) = 5670, x⁸ = 5670/⁸C₄, and bottom-left (8+1)/2 , (8+2)/2 ↧ 5 , (8+3)/2 with the outer two circled.</w:t>
+      </w:r>
+    </w:p>
+    <w:p>
+      <w:r>
+        <w:rPr>
+          <w:b/>
+        </w:rPr>
+        <w:t>DIBY:</w:t>
+      </w:r>
+      <w:r>
+        <w:t xml:space="preserve"> YES — printed labels DIBY-01, DIBY-02, DIBY-03. </w:t>
+      </w:r>
+      <w:r>
+        <w:rPr>
+          <w:b/>
+        </w:rPr>
+        <w:t>U:</w:t>
+      </w:r>
+      <w:r>
+        <w:t xml:space="preserve"> none.</w:t>
+      </w:r>
+    </w:p>
+    <w:p>
+      <w:pPr>
+        <w:pStyle w:val="Heading1"/>
+      </w:pPr>
+      <w:r>
+        <w:t>p32 · Printed # DIBY-04/05/06 block · label: — (PW roundel)</w:t>
+      </w:r>
+    </w:p>
+    <w:p>
+      <w:r>
+        <w:rPr>
+          <w:b/>
+        </w:rPr>
+        <w:t>P:</w:t>
+      </w:r>
+      <w:r>
+        <w:t xml:space="preserve"> continuing the block:</w:t>
+      </w:r>
+    </w:p>
+    <w:p>
+      <w:pPr>
+        <w:pStyle w:val="ListBullet"/>
+      </w:pPr>
+      <w:r>
+        <w:rPr>
+          <w:b/>
+        </w:rPr>
+        <w:t>DIBY-04</w:t>
+      </w:r>
+      <w:r>
+        <w:t xml:space="preserve"> (green tag) — </w:t>
+      </w:r>
+      <w:r>
+        <w:rPr>
+          <w:b/>
+        </w:rPr>
+        <w:t>The ratio of the coefficient of the middle term in the expansion of (1 + x)²⁰ and the sum of the coefficients of two middle terms in the expansion of (1 + x)¹⁹ is</w:t>
+      </w:r>
+      <w:r>
+        <w:t xml:space="preserve"> · </w:t>
+      </w:r>
+      <w:r>
+        <w:rPr>
+          <w:b/>
+        </w:rPr>
+        <w:t>[JEE Mains–2021]</w:t>
+      </w:r>
+      <w:r>
+        <w:t xml:space="preserve"> · </w:t>
+      </w:r>
+      <w:r>
+        <w:rPr>
+          <w:b/>
+        </w:rPr>
+        <w:t>Ans. : 1</w:t>
+      </w:r>
+      <w:r>
+        <w:t>.</w:t>
+      </w:r>
+    </w:p>
+    <w:p>
+      <w:pPr>
+        <w:pStyle w:val="ListBullet"/>
+      </w:pPr>
+      <w:r>
+        <w:rPr>
+          <w:b/>
+        </w:rPr>
+        <w:t>DIBY-05</w:t>
+      </w:r>
+      <w:r>
+        <w:t xml:space="preserve"> (red tag) — </w:t>
+      </w:r>
+      <w:r>
+        <w:rPr>
+          <w:b/>
+        </w:rPr>
+        <w:t>If the constant term, in binomial expansion of (2xʳ + 1/x²)¹⁰ is 180, then r is</w:t>
+      </w:r>
+      <w:r>
+        <w:t xml:space="preserve"> · </w:t>
+      </w:r>
+      <w:r>
+        <w:rPr>
+          <w:b/>
+        </w:rPr>
+        <w:t>[JEE Mains–2021]</w:t>
+      </w:r>
+      <w:r>
+        <w:t xml:space="preserve"> · </w:t>
+      </w:r>
+      <w:r>
+        <w:rPr>
+          <w:b/>
+        </w:rPr>
+        <w:t>Ans. : 8</w:t>
+      </w:r>
+      <w:r>
+        <w:t xml:space="preserve"> (the 8 in red).</w:t>
+      </w:r>
+    </w:p>
+    <w:p>
+      <w:pPr>
+        <w:pStyle w:val="ListBullet"/>
+      </w:pPr>
+      <w:r>
+        <w:rPr>
+          <w:b/>
+        </w:rPr>
+        <w:t>DIBY-06</w:t>
+      </w:r>
+      <w:r>
+        <w:t xml:space="preserve"> (green tag) — </w:t>
+      </w:r>
+      <w:r>
+        <w:rPr>
+          <w:b/>
+        </w:rPr>
+        <w:t>If the term independent of x in the expansion of (√a x² + 1/(2x³))¹⁰ is 105, then a² is equal to</w:t>
+      </w:r>
+      <w:r>
+        <w:t xml:space="preserve"> · </w:t>
+      </w:r>
+      <w:r>
+        <w:rPr>
+          <w:b/>
+        </w:rPr>
+        <w:t>(A) 2 (B) 4 (C) 6 (D) 9</w:t>
+      </w:r>
+      <w:r>
+        <w:t xml:space="preserve"> · </w:t>
+      </w:r>
+      <w:r>
+        <w:rPr>
+          <w:b/>
+        </w:rPr>
+        <w:t>[JEE Mains–2024]</w:t>
+      </w:r>
+      <w:r>
+        <w:t xml:space="preserve"> · </w:t>
+      </w:r>
+      <w:r>
+        <w:rPr>
+          <w:b/>
+        </w:rPr>
+        <w:t>Ans. : (B)</w:t>
+      </w:r>
+      <w:r>
+        <w:t>.</w:t>
+      </w:r>
+    </w:p>
+    <w:p>
+      <w:r>
+        <w:rPr>
+          <w:b/>
+        </w:rPr>
+        <w:t>H:</w:t>
+      </w:r>
+      <w:r>
+        <w:t xml:space="preserve"> top orange (²⁰C₁₀ x¹⁰) = M.T. = T₁₀₊₁ with an arrow into the (1+x)¹⁹ clause; T₁₀ = ¹⁹C₉ x⁹, T₁₁ = ¹⁹C₁₀ x¹⁰, T₁₀ , T₁₁; pink fnf = ²⁰C₁₀/(¹⁹C₉ + ¹⁹C₁₀) + pink tick; for DIBY-05 pink ¹⁰C_k 2^{10−k} · x^{10r−rk−2k} = ¹⁰C_k (2xʳ)^{10−k} (1/x²)^k with 10r−rk−2k circled and a 0 written above it (the constant-term condition).</w:t>
+      </w:r>
+    </w:p>
+    <w:p>
+      <w:r>
+        <w:rPr>
+          <w:b/>
+        </w:rPr>
+        <w:t>DIBY:</w:t>
+      </w:r>
+      <w:r>
+        <w:t xml:space="preserve"> YES — printed labels DIBY-04, DIBY-05, DIBY-06. </w:t>
+      </w:r>
+      <w:r>
+        <w:rPr>
+          <w:b/>
+        </w:rPr>
+        <w:t>U:</w:t>
+      </w:r>
+      <w:r>
+        <w:t xml:space="preserve"> none.</w:t>
+      </w:r>
+    </w:p>
+    <w:p>
+      <w:pPr>
+        <w:pStyle w:val="Heading1"/>
+      </w:pPr>
+      <w:r>
+        <w:t>p33 · Printed # DIBY-07/08/09 block · label: — (PW roundel)</w:t>
+      </w:r>
+    </w:p>
+    <w:p>
+      <w:r>
+        <w:rPr>
+          <w:b/>
+        </w:rPr>
+        <w:t>P:</w:t>
+      </w:r>
+      <w:r>
+        <w:t xml:space="preserve"> three more printed items, same green # DIBY-0N tags, no handwriting at all:</w:t>
+      </w:r>
+    </w:p>
+    <w:p>
+      <w:pPr>
+        <w:pStyle w:val="ListBullet"/>
+      </w:pPr>
+      <w:r>
+        <w:rPr>
+          <w:b/>
+        </w:rPr>
+        <w:t>DIBY-07</w:t>
+      </w:r>
+      <w:r>
+        <w:t xml:space="preserve"> — </w:t>
+      </w:r>
+      <w:r>
+        <w:rPr>
+          <w:b/>
+        </w:rPr>
+        <w:t>If the constant term in the expansion of ( ⁵√3/x + 2x/∛5 )¹², x ≠ 0 is α × 2⁸ × √3, then 25α is equal to</w:t>
+      </w:r>
+      <w:r>
+        <w:t xml:space="preserve"> (25α cyan) · yellow </w:t>
+      </w:r>
+      <w:r>
+        <w:rPr>
+          <w:b/>
+        </w:rPr>
+        <w:t>[JEE Mains–2024]</w:t>
+      </w:r>
+      <w:r>
+        <w:t xml:space="preserve"> · </w:t>
+      </w:r>
+      <w:r>
+        <w:rPr>
+          <w:b/>
+        </w:rPr>
+        <w:t>Ans. : 693</w:t>
+      </w:r>
+      <w:r>
+        <w:t>.</w:t>
+      </w:r>
+    </w:p>
+    <w:p>
+      <w:pPr>
+        <w:pStyle w:val="ListBullet"/>
+      </w:pPr>
+      <w:r>
+        <w:rPr>
+          <w:b/>
+        </w:rPr>
+        <w:t>DIBY-08</w:t>
+      </w:r>
+      <w:r>
+        <w:t xml:space="preserve"> — </w:t>
+      </w:r>
+      <w:r>
+        <w:rPr>
+          <w:b/>
+        </w:rPr>
+        <w:t>If the term without x in the expansion of (x^{2/3} + α/x³)²² is 7315, then |α| is equal to</w:t>
+      </w:r>
+      <w:r>
+        <w:t xml:space="preserve"> (|α| cyan) · </w:t>
+      </w:r>
+      <w:r>
+        <w:rPr>
+          <w:b/>
+        </w:rPr>
+        <w:t>[JEE Mains–2023]</w:t>
+      </w:r>
+      <w:r>
+        <w:t xml:space="preserve"> · </w:t>
+      </w:r>
+      <w:r>
+        <w:rPr>
+          <w:b/>
+        </w:rPr>
+        <w:t>Ans. : 1</w:t>
+      </w:r>
+      <w:r>
+        <w:t>.</w:t>
+      </w:r>
+    </w:p>
+    <w:p>
+      <w:pPr>
+        <w:pStyle w:val="ListBullet"/>
+      </w:pPr>
+      <w:r>
+        <w:rPr>
+          <w:b/>
+        </w:rPr>
+        <w:t>DIBY-09</w:t>
+      </w:r>
+      <w:r>
+        <w:t xml:space="preserve"> — </w:t>
+      </w:r>
+      <w:r>
+        <w:rPr>
+          <w:b/>
+        </w:rPr>
+        <w:t>If the coefficient of x⁴, x and x⁶ in the expansion of (1 + x)ⁿ are the arithmetic progression then the maximum value of n is</w:t>
+      </w:r>
+      <w:r>
+        <w:t xml:space="preserve"> (n cyan) · </w:t>
+      </w:r>
+      <w:r>
+        <w:rPr>
+          <w:b/>
+        </w:rPr>
+        <w:t>(A) 7 (B) 21 (C) 28 (D) 14</w:t>
+      </w:r>
+      <w:r>
+        <w:t xml:space="preserve"> · </w:t>
+      </w:r>
+      <w:r>
+        <w:rPr>
+          <w:b/>
+        </w:rPr>
+        <w:t>[JEE Mains–2024]</w:t>
+      </w:r>
+      <w:r>
+        <w:t xml:space="preserve"> · </w:t>
+      </w:r>
+      <w:r>
+        <w:rPr>
+          <w:b/>
+        </w:rPr>
+        <w:t>Ans. : (D)</w:t>
+      </w:r>
+      <w:r>
+        <w:t>.</w:t>
+      </w:r>
+    </w:p>
+    <w:p>
+      <w:r>
+        <w:rPr>
+          <w:b/>
+        </w:rPr>
+        <w:t>H:</w:t>
+      </w:r>
+      <w:r>
+        <w:t xml:space="preserve"> none. </w:t>
+      </w:r>
+      <w:r>
+        <w:rPr>
+          <w:b/>
+        </w:rPr>
+        <w:t>DIBY:</w:t>
+      </w:r>
+      <w:r>
+        <w:t xml:space="preserve"> YES — printed labels DIBY-07, DIBY-08, DIBY-09. </w:t>
+      </w:r>
+      <w:r>
+        <w:rPr>
+          <w:b/>
+        </w:rPr>
+        <w:t>U:</w:t>
+      </w:r>
+      <w:r>
+        <w:t xml:space="preserve"> none.</w:t>
+      </w:r>
+    </w:p>
+    <w:p>
+      <w:pPr>
+        <w:pStyle w:val="Heading1"/>
+      </w:pPr>
+      <w:r>
+        <w:t>p34 · Closing card: Thank You · label: — (PW roundel)</w:t>
+      </w:r>
+    </w:p>
+    <w:p>
+      <w:r>
+        <w:rPr>
+          <w:b/>
+        </w:rPr>
+        <w:t>P:</w:t>
+      </w:r>
+      <w:r>
+        <w:t xml:space="preserve"> script lines "It is never about </w:t>
+      </w:r>
+      <w:r>
+        <w:rPr>
+          <w:i/>
+        </w:rPr>
+        <w:t>end result</w:t>
+      </w:r>
+      <w:r>
+        <w:t xml:space="preserve">" (white + red) / "It's always about </w:t>
+      </w:r>
+      <w:r>
+        <w:rPr>
+          <w:i/>
+        </w:rPr>
+        <w:t>Journey</w:t>
+      </w:r>
+      <w:r>
+        <w:t xml:space="preserve">" (white + cyan); huge </w:t>
+      </w:r>
+      <w:r>
+        <w:rPr>
+          <w:b/>
+        </w:rPr>
+        <w:t>Thank</w:t>
+      </w:r>
+      <w:r>
+        <w:t xml:space="preserve"> in yellow + </w:t>
+      </w:r>
+      <w:r>
+        <w:rPr>
+          <w:b/>
+        </w:rPr>
+        <w:t>You</w:t>
+      </w:r>
+      <w:r>
+        <w:t xml:space="preserve"> in white script; cyan hashtag with a red drop-shadow </w:t>
+      </w:r>
+      <w:r>
+        <w:rPr>
+          <w:b/>
+        </w:rPr>
+        <w:t>#futurellTians</w:t>
+      </w:r>
+      <w:r>
+        <w:t xml:space="preserve"> (spelling as printed).</w:t>
+      </w:r>
+    </w:p>
+    <w:p>
+      <w:r>
+        <w:rPr>
+          <w:b/>
+        </w:rPr>
+        <w:t>H:</w:t>
+      </w:r>
+      <w:r>
+        <w:t xml:space="preserve"> none. </w:t>
+      </w:r>
+      <w:r>
+        <w:rPr>
+          <w:b/>
+        </w:rPr>
+        <w:t>DIBY:</w:t>
+      </w:r>
+      <w:r>
+        <w:t xml:space="preserve"> none. </w:t>
+      </w:r>
+      <w:r>
+        <w:rPr>
+          <w:b/>
+        </w:rPr>
+        <w:t>U:</w:t>
+      </w:r>
+      <w:r>
+        <w:t xml:space="preserve"> 1 — the hashtag reads #futurellTians (double l) on this deck; kept exactly as printed. Page 34.</w:t>
+      </w:r>
+    </w:p>
+    <w:p>
+      <w:pPr>
+        <w:pStyle w:val="Heading1"/>
+      </w:pPr>
+      <w:r>
+        <w:t>p35 · Printed # DIBY-10/11/12 block (after the Thank-You card) · label: — (PW roundel)</w:t>
+      </w:r>
+    </w:p>
+    <w:p>
+      <w:r>
+        <w:rPr>
+          <w:b/>
+        </w:rPr>
+        <w:t>P:</w:t>
+      </w:r>
+      <w:r>
+        <w:t xml:space="preserve"> the DIBY list continues on the page </w:t>
+      </w:r>
+      <w:r>
+        <w:rPr>
+          <w:i/>
+        </w:rPr>
+        <w:t>after</w:t>
+      </w:r>
+      <w:r>
+        <w:t xml:space="preserve"> the closing card:</w:t>
+      </w:r>
+    </w:p>
+    <w:p>
+      <w:pPr>
+        <w:pStyle w:val="ListBullet"/>
+      </w:pPr>
+      <w:r>
+        <w:rPr>
+          <w:b/>
+        </w:rPr>
+        <w:t>DIBY-10</w:t>
+      </w:r>
+      <w:r>
+        <w:t xml:space="preserve"> — </w:t>
+      </w:r>
+      <w:r>
+        <w:rPr>
+          <w:b/>
+        </w:rPr>
+        <w:t>Let the coefficient of three consecutive terms in the binomial expansion of (1 + 2x)ⁿ be in the ratio 2 : 5 : 8. Then the coefficient of the term, which is in the middle of these three terms, is</w:t>
+      </w:r>
+      <w:r>
+        <w:t xml:space="preserve"> · </w:t>
+      </w:r>
+      <w:r>
+        <w:rPr>
+          <w:b/>
+        </w:rPr>
+        <w:t>[JEE Mains–2023]</w:t>
+      </w:r>
+      <w:r>
+        <w:t xml:space="preserve"> · </w:t>
+      </w:r>
+      <w:r>
+        <w:rPr>
+          <w:b/>
+        </w:rPr>
+        <w:t>Ans. : 1120</w:t>
+      </w:r>
+      <w:r>
+        <w:t>.</w:t>
+      </w:r>
+    </w:p>
+    <w:p>
+      <w:pPr>
+        <w:pStyle w:val="ListBullet"/>
+      </w:pPr>
+      <w:r>
+        <w:rPr>
+          <w:b/>
+        </w:rPr>
+        <w:t>DIBY-11</w:t>
+      </w:r>
+      <w:r>
+        <w:t xml:space="preserve"> — </w:t>
+      </w:r>
+      <w:r>
+        <w:rPr>
+          <w:b/>
+        </w:rPr>
+        <w:t>If the coefficient of x⁷ in (x² + 1/(bx))¹¹ and x⁻⁷ in (x − 1/(bx²))¹¹ (b ≠ 0), are equal, then the value of b is equal to</w:t>
+      </w:r>
+      <w:r>
+        <w:t xml:space="preserve"> (b cyan) · </w:t>
+      </w:r>
+      <w:r>
+        <w:rPr>
+          <w:b/>
+        </w:rPr>
+        <w:t>(A) 2 (B) −1 (C) 1 (D) −2</w:t>
+      </w:r>
+      <w:r>
+        <w:t xml:space="preserve"> · </w:t>
+      </w:r>
+      <w:r>
+        <w:rPr>
+          <w:b/>
+        </w:rPr>
+        <w:t>[JEE Mains–2021]</w:t>
+      </w:r>
+      <w:r>
+        <w:t xml:space="preserve"> · </w:t>
+      </w:r>
+      <w:r>
+        <w:rPr>
+          <w:b/>
+        </w:rPr>
+        <w:t>Ans. : (C)</w:t>
+      </w:r>
+      <w:r>
+        <w:t>.</w:t>
+      </w:r>
+    </w:p>
+    <w:p>
+      <w:pPr>
+        <w:pStyle w:val="ListBullet"/>
+      </w:pPr>
+      <w:r>
+        <w:rPr>
+          <w:b/>
+        </w:rPr>
+        <w:t>DIBY-12</w:t>
+      </w:r>
+      <w:r>
+        <w:t xml:space="preserve"> — </w:t>
+      </w:r>
+      <w:r>
+        <w:rPr>
+          <w:b/>
+        </w:rPr>
+        <w:t>If the co-efficient of x⁹ in (αx³ + 1/(βx))¹¹ and the co-efficient x⁻⁹ in (αx − 1/(βx³))¹¹ are equal to, then (αβ)² is equal to</w:t>
+      </w:r>
+      <w:r>
+        <w:t xml:space="preserve"> ((αβ)² cyan) · </w:t>
+      </w:r>
+      <w:r>
+        <w:rPr>
+          <w:b/>
+        </w:rPr>
+        <w:t>[JEE Mains–2023]</w:t>
+      </w:r>
+      <w:r>
+        <w:t xml:space="preserve"> · </w:t>
+      </w:r>
+      <w:r>
+        <w:rPr>
+          <w:b/>
+        </w:rPr>
+        <w:t>Ans. : 1</w:t>
+      </w:r>
+      <w:r>
+        <w:t>.</w:t>
+      </w:r>
+    </w:p>
+    <w:p>
+      <w:r>
+        <w:rPr>
+          <w:b/>
+        </w:rPr>
+        <w:t>H:</w:t>
+      </w:r>
+      <w:r>
+        <w:t xml:space="preserve"> none. </w:t>
+      </w:r>
+      <w:r>
+        <w:rPr>
+          <w:b/>
+        </w:rPr>
+        <w:t>DIBY:</w:t>
+      </w:r>
+      <w:r>
+        <w:t xml:space="preserve"> YES — printed labels DIBY-10, DIBY-11, DIBY-12. </w:t>
+      </w:r>
+      <w:r>
+        <w:rPr>
+          <w:b/>
+        </w:rPr>
+        <w:t>U:</w:t>
+      </w:r>
+      <w:r>
+        <w:t xml:space="preserve"> 1 — the file's slide order puts this DIBY block after the Thank-You card; transcribed in PDF order. Page 35.</w:t>
+      </w:r>
+    </w:p>
+    <w:p>
+      <w:pPr>
+        <w:pStyle w:val="Heading2"/>
+      </w:pPr>
+      <w:r>
+        <w:t>Lecture close-out — Binomial Theorem L03 (35 pages, PDF pp. 1–35)</w:t>
+      </w:r>
+    </w:p>
+    <w:p>
+      <w:r>
+        <w:t>* Coverage: p01–p35, every page transcribed from the rendered image (no text layer exists in this PDF).</w:t>
+      </w:r>
+    </w:p>
+    <w:p>
+      <w:r>
+        <w:rPr>
+          <w:i/>
+        </w:rPr>
+        <w:t xml:space="preserve"> Printed page labels observed: 149 (p12), 151 (p09, p13, p16), 152 (p21–p26), 153 (p28) — the module's numbering repeats and does </w:t>
+      </w:r>
+      <w:r>
+        <w:rPr>
+          <w:i/>
+        </w:rPr>
+        <w:t>not</w:t>
+      </w:r>
+      <w:r>
+        <w:t>* track PDF page order; every entry above is keyed to the PDF page.</w:t>
+      </w:r>
+    </w:p>
+    <w:p>
+      <w:r>
+        <w:t>* DIBY items in this lecture: 15 (2 printed blocks of DIBY-01…05 on p11/p14 and DIBY-01…12 on p31–p33/p35 — the numbering restarts, so DIBY-01 exists twice with different content), plus 4 handwritten tags (p18 DIBY-(A), p21 DIBY-(B), p29 90%. DIBY, p11/p14 printed set already counted). All are in diby/diby_index_twin1.csv.</w:t>
+      </w:r>
+    </w:p>
+    <w:p>
+      <w:r>
+        <w:t>* Cross-lecture chains leaving this file: solutions to Binomial Theorem L02 p22 (a²) on p08; L02 p24 recap → p09; L02 p27 → p12. Cross-lecture duplicate worth noting for any de-duplication pass: L03 p31–p32 repeats the six printed DIBY questions of L02 p37–p38 in a different order and with different answer keys; L03 p32 supplies Ans.: 8 for the item whose answer line is blank (....) in L02 p38.</w:t>
+      </w:r>
+    </w:p>
+    <w:p>
+      <w:r>
+        <w:t>* Recurring source defects transcribed as printed: unclosed [JEE (Adv.)-2023 bracket (p09, p26-chip style), chip typo IVRTTATIONAL (p16), duplicate item number 6 (p06), hashtag #futurellTians (p34).</w:t>
       </w:r>
     </w:p>
     <w:sectPr>

</xml_diff>